<commit_message>
(docs) readme update nad attestation update
</commit_message>
<xml_diff>
--- a/attestation/[RODRIGUEZ,ACRPR]_SIGNED_ORI_ATTESTATION_FORM.docx
+++ b/attestation/[RODRIGUEZ,ACRPR]_SIGNED_ORI_ATTESTATION_FORM.docx
@@ -212,7 +212,25 @@
           <w:sz w:val="21"/>
           <w:szCs w:val="21"/>
         </w:rPr>
-        <w:t>This written work/document is our own work and is free from plagiarism or collusion.</w:t>
+        <w:t xml:space="preserve">This </w:t>
+      </w:r>
+      <w:proofErr w:type="gramStart"/>
+      <w:r>
+        <w:rPr>
+          <w:rFonts w:ascii="Palatino Linotype" w:eastAsia="Palatino Linotype" w:hAnsi="Palatino Linotype" w:cs="Palatino Linotype"/>
+          <w:sz w:val="21"/>
+          <w:szCs w:val="21"/>
+        </w:rPr>
+        <w:t>written work/</w:t>
+      </w:r>
+      <w:proofErr w:type="gramEnd"/>
+      <w:r>
+        <w:rPr>
+          <w:rFonts w:ascii="Palatino Linotype" w:eastAsia="Palatino Linotype" w:hAnsi="Palatino Linotype" w:cs="Palatino Linotype"/>
+          <w:sz w:val="21"/>
+          <w:szCs w:val="21"/>
+        </w:rPr>
+        <w:t>document is our own work and is free from plagiarism or collusion.</w:t>
       </w:r>
     </w:p>
     <w:p>
@@ -426,7 +444,16 @@
           <w:sz w:val="21"/>
           <w:szCs w:val="21"/>
         </w:rPr>
-        <w:t>for source code and documentation syntax</w:t>
+        <w:t>for source code and documentation</w:t>
+      </w:r>
+      <w:proofErr w:type="gramStart"/>
+      <w:r>
+        <w:rPr>
+          <w:rFonts w:ascii="Palatino Linotype" w:eastAsia="Palatino Linotype" w:hAnsi="Palatino Linotype" w:cs="Palatino Linotype"/>
+          <w:sz w:val="21"/>
+          <w:szCs w:val="21"/>
+        </w:rPr>
+        <w:t xml:space="preserve"> syntax</w:t>
       </w:r>
       <w:r>
         <w:rPr>
@@ -466,7 +493,16 @@
           <w:sz w:val="21"/>
           <w:szCs w:val="21"/>
         </w:rPr>
-        <w:t xml:space="preserve">. </w:t>
+        <w:t>.</w:t>
+      </w:r>
+      <w:proofErr w:type="gramEnd"/>
+      <w:r>
+        <w:rPr>
+          <w:rFonts w:ascii="Palatino Linotype" w:eastAsia="Palatino Linotype" w:hAnsi="Palatino Linotype" w:cs="Palatino Linotype"/>
+          <w:sz w:val="21"/>
+          <w:szCs w:val="21"/>
+        </w:rPr>
+        <w:t xml:space="preserve"> </w:t>
       </w:r>
       <w:r>
         <w:rPr>
@@ -783,6 +819,76 @@
           <w:szCs w:val="21"/>
         </w:rPr>
       </w:pPr>
+      <w:r>
+        <w:rPr>
+          <w:rFonts w:ascii="Palatino Linotype" w:eastAsia="Palatino Linotype" w:hAnsi="Palatino Linotype" w:cs="Palatino Linotype"/>
+          <w:noProof/>
+          <w:sz w:val="21"/>
+          <w:szCs w:val="21"/>
+        </w:rPr>
+        <w:drawing>
+          <wp:anchor distT="0" distB="0" distL="114300" distR="114300" simplePos="0" relativeHeight="251658240" behindDoc="0" locked="0" layoutInCell="1" allowOverlap="1" wp14:anchorId="339D6524" wp14:editId="3A867AC9">
+            <wp:simplePos x="0" y="0"/>
+            <wp:positionH relativeFrom="column">
+              <wp:posOffset>3629025</wp:posOffset>
+            </wp:positionH>
+            <wp:positionV relativeFrom="paragraph">
+              <wp:posOffset>116225</wp:posOffset>
+            </wp:positionV>
+            <wp:extent cx="1465007" cy="473075"/>
+            <wp:effectExtent l="0" t="0" r="0" b="0"/>
+            <wp:wrapNone/>
+            <wp:docPr id="1899017535" name="Picture 2"/>
+            <wp:cNvGraphicFramePr>
+              <a:graphicFrameLocks xmlns:a="http://schemas.openxmlformats.org/drawingml/2006/main" noChangeAspect="1"/>
+            </wp:cNvGraphicFramePr>
+            <a:graphic xmlns:a="http://schemas.openxmlformats.org/drawingml/2006/main">
+              <a:graphicData uri="http://schemas.openxmlformats.org/drawingml/2006/picture">
+                <pic:pic xmlns:pic="http://schemas.openxmlformats.org/drawingml/2006/picture">
+                  <pic:nvPicPr>
+                    <pic:cNvPr id="0" name="Picture 2"/>
+                    <pic:cNvPicPr>
+                      <a:picLocks noChangeAspect="1" noChangeArrowheads="1"/>
+                    </pic:cNvPicPr>
+                  </pic:nvPicPr>
+                  <pic:blipFill>
+                    <a:blip r:embed="rId9" cstate="print">
+                      <a:extLst>
+                        <a:ext uri="{28A0092B-C50C-407E-A947-70E740481C1C}">
+                          <a14:useLocalDpi xmlns:a14="http://schemas.microsoft.com/office/drawing/2010/main" val="0"/>
+                        </a:ext>
+                      </a:extLst>
+                    </a:blip>
+                    <a:srcRect/>
+                    <a:stretch>
+                      <a:fillRect/>
+                    </a:stretch>
+                  </pic:blipFill>
+                  <pic:spPr bwMode="auto">
+                    <a:xfrm>
+                      <a:off x="0" y="0"/>
+                      <a:ext cx="1465007" cy="473075"/>
+                    </a:xfrm>
+                    <a:prstGeom prst="rect">
+                      <a:avLst/>
+                    </a:prstGeom>
+                    <a:noFill/>
+                    <a:ln>
+                      <a:noFill/>
+                    </a:ln>
+                  </pic:spPr>
+                </pic:pic>
+              </a:graphicData>
+            </a:graphic>
+            <wp14:sizeRelH relativeFrom="margin">
+              <wp14:pctWidth>0</wp14:pctWidth>
+            </wp14:sizeRelH>
+            <wp14:sizeRelV relativeFrom="margin">
+              <wp14:pctHeight>0</wp14:pctHeight>
+            </wp14:sizeRelV>
+          </wp:anchor>
+        </w:drawing>
+      </w:r>
     </w:p>
     <w:p>
       <w:pPr>
@@ -1111,7 +1217,25 @@
           <w:sz w:val="21"/>
           <w:szCs w:val="21"/>
         </w:rPr>
-        <w:t>Date signed:  _________________________</w:t>
+        <w:t xml:space="preserve">Date signed: </w:t>
+      </w:r>
+      <w:proofErr w:type="gramStart"/>
+      <w:r>
+        <w:rPr>
+          <w:rFonts w:ascii="Palatino Linotype" w:eastAsia="Palatino Linotype" w:hAnsi="Palatino Linotype" w:cs="Palatino Linotype"/>
+          <w:sz w:val="21"/>
+          <w:szCs w:val="21"/>
+        </w:rPr>
+        <w:t xml:space="preserve"> __</w:t>
+      </w:r>
+      <w:proofErr w:type="gramEnd"/>
+      <w:r>
+        <w:rPr>
+          <w:rFonts w:ascii="Palatino Linotype" w:eastAsia="Palatino Linotype" w:hAnsi="Palatino Linotype" w:cs="Palatino Linotype"/>
+          <w:sz w:val="21"/>
+          <w:szCs w:val="21"/>
+        </w:rPr>
+        <w:t>_______________________</w:t>
       </w:r>
       <w:r>
         <w:rPr>
@@ -1147,8 +1271,8 @@
       </w:pPr>
     </w:p>
     <w:sectPr>
-      <w:headerReference w:type="default" r:id="rId9"/>
-      <w:footerReference w:type="default" r:id="rId10"/>
+      <w:headerReference w:type="default" r:id="rId10"/>
+      <w:footerReference w:type="default" r:id="rId11"/>
       <w:pgSz w:w="11906" w:h="16838"/>
       <w:pgMar w:top="1440" w:right="1440" w:bottom="1440" w:left="1440" w:header="2160" w:footer="720" w:gutter="0"/>
       <w:cols w:space="720"/>

</xml_diff>